<commit_message>
Update Sublime Text and WezTerm cheat sheet
Co-Authored-By: Claude Opus 4.6 <noreply@anthropic.com>
</commit_message>
<xml_diff>
--- a/docs/cheatsheets/Sublime_and_WezTerm_Cheat_Sheet.docx
+++ b/docs/cheatsheets/Sublime_and_WezTerm_Cheat_Sheet.docx
@@ -3123,7 +3123,7 @@
           <w:i/>
           <w:sz w:val="16"/>
         </w:rPr>
-        <w:t>Scrollback is 50,000 lines — scroll freely with mouse or Shift+PageUp</w:t>
+        <w:t>Scrollback is 10,000 lines — scroll freely with mouse or Shift+PageUp</w:t>
       </w:r>
     </w:p>
     <w:p>
@@ -3175,6 +3175,493 @@
           <w:sz w:val="16"/>
         </w:rPr>
         <w:t>Panes remember their directory — split and you start in the same folder</w:t>
+      </w:r>
+    </w:p>
+    <w:p>
+      <w:r>
+        <w:rPr>
+          <w:b/>
+          <w:color w:val="F38BA8"/>
+          <w:sz w:val="22"/>
+        </w:rPr>
+        <w:t>LINKS &amp; URLS</w:t>
+      </w:r>
+    </w:p>
+    <w:tbl>
+      <w:tblPr>
+        <w:tblW w:type="auto" w:w="0"/>
+        <w:tblLayout w:type="autofit"/>
+        <w:tblLook w:firstColumn="1" w:firstRow="1" w:lastColumn="0" w:lastRow="0" w:noHBand="0" w:noVBand="1" w:val="04A0"/>
+      </w:tblPr>
+      <w:tblGrid>
+        <w:gridCol w:w="5270"/>
+        <w:gridCol w:w="5270"/>
+      </w:tblGrid>
+      <w:tr>
+        <w:tc>
+          <w:tcPr>
+            <w:tcW w:type="dxa" w:w="5270"/>
+          </w:tcPr>
+          <w:p>
+            <w:r>
+              <w:rPr>
+                <w:rFonts w:ascii="Courier New" w:hAnsi="Courier New"/>
+                <w:b/>
+                <w:sz w:val="18"/>
+              </w:rPr>
+              <w:t>Ctrl+Click</w:t>
+            </w:r>
+          </w:p>
+        </w:tc>
+        <w:tc>
+          <w:tcPr>
+            <w:tcW w:type="dxa" w:w="5270"/>
+          </w:tcPr>
+          <w:p>
+            <w:r>
+              <w:rPr>
+                <w:sz w:val="18"/>
+              </w:rPr>
+              <w:t>Open URL in browser</w:t>
+            </w:r>
+          </w:p>
+        </w:tc>
+      </w:tr>
+      <w:tr>
+        <w:tc>
+          <w:tcPr>
+            <w:tcW w:type="dxa" w:w="5270"/>
+          </w:tcPr>
+          <w:p>
+            <w:r>
+              <w:rPr>
+                <w:rFonts w:ascii="Courier New" w:hAnsi="Courier New"/>
+                <w:b/>
+                <w:sz w:val="18"/>
+              </w:rPr>
+              <w:t>Hover over URL</w:t>
+            </w:r>
+          </w:p>
+        </w:tc>
+        <w:tc>
+          <w:tcPr>
+            <w:tcW w:type="dxa" w:w="5270"/>
+          </w:tcPr>
+          <w:p>
+            <w:r>
+              <w:rPr>
+                <w:sz w:val="18"/>
+              </w:rPr>
+              <w:t>URL underlines when clickable</w:t>
+            </w:r>
+          </w:p>
+        </w:tc>
+      </w:tr>
+    </w:tbl>
+    <w:p>
+      <w:r>
+        <w:rPr>
+          <w:b/>
+          <w:color w:val="F38BA8"/>
+          <w:sz w:val="22"/>
+        </w:rPr>
+        <w:t>WINDOW MANAGEMENT</w:t>
+      </w:r>
+    </w:p>
+    <w:tbl>
+      <w:tblPr>
+        <w:tblW w:type="auto" w:w="0"/>
+        <w:tblLayout w:type="autofit"/>
+        <w:tblLook w:firstColumn="1" w:firstRow="1" w:lastColumn="0" w:lastRow="0" w:noHBand="0" w:noVBand="1" w:val="04A0"/>
+      </w:tblPr>
+      <w:tblGrid>
+        <w:gridCol w:w="5270"/>
+        <w:gridCol w:w="5270"/>
+      </w:tblGrid>
+      <w:tr>
+        <w:tc>
+          <w:tcPr>
+            <w:tcW w:type="dxa" w:w="5270"/>
+          </w:tcPr>
+          <w:p>
+            <w:r>
+              <w:rPr>
+                <w:rFonts w:ascii="Courier New" w:hAnsi="Courier New"/>
+                <w:b/>
+                <w:sz w:val="18"/>
+              </w:rPr>
+              <w:t>Alt+Enter</w:t>
+            </w:r>
+          </w:p>
+        </w:tc>
+        <w:tc>
+          <w:tcPr>
+            <w:tcW w:type="dxa" w:w="5270"/>
+          </w:tcPr>
+          <w:p>
+            <w:r>
+              <w:rPr>
+                <w:sz w:val="18"/>
+              </w:rPr>
+              <w:t>Toggle full screen</w:t>
+            </w:r>
+          </w:p>
+        </w:tc>
+      </w:tr>
+      <w:tr>
+        <w:tc>
+          <w:tcPr>
+            <w:tcW w:type="dxa" w:w="5270"/>
+          </w:tcPr>
+          <w:p>
+            <w:r>
+              <w:rPr>
+                <w:rFonts w:ascii="Courier New" w:hAnsi="Courier New"/>
+                <w:b/>
+                <w:sz w:val="18"/>
+              </w:rPr>
+              <w:t>Ctrl+Shift+N</w:t>
+            </w:r>
+          </w:p>
+        </w:tc>
+        <w:tc>
+          <w:tcPr>
+            <w:tcW w:type="dxa" w:w="5270"/>
+          </w:tcPr>
+          <w:p>
+            <w:r>
+              <w:rPr>
+                <w:sz w:val="18"/>
+              </w:rPr>
+              <w:t>New window</w:t>
+            </w:r>
+          </w:p>
+        </w:tc>
+      </w:tr>
+      <w:tr>
+        <w:tc>
+          <w:tcPr>
+            <w:tcW w:type="dxa" w:w="5270"/>
+          </w:tcPr>
+          <w:p>
+            <w:r>
+              <w:rPr>
+                <w:rFonts w:ascii="Courier New" w:hAnsi="Courier New"/>
+                <w:b/>
+                <w:sz w:val="18"/>
+              </w:rPr>
+              <w:t>Ctrl+Shift+L</w:t>
+            </w:r>
+          </w:p>
+        </w:tc>
+        <w:tc>
+          <w:tcPr>
+            <w:tcW w:type="dxa" w:w="5270"/>
+          </w:tcPr>
+          <w:p>
+            <w:r>
+              <w:rPr>
+                <w:sz w:val="18"/>
+              </w:rPr>
+              <w:t>SSH Launcher (custom)</w:t>
+            </w:r>
+          </w:p>
+        </w:tc>
+      </w:tr>
+      <w:tr>
+        <w:tc>
+          <w:tcPr>
+            <w:tcW w:type="dxa" w:w="5270"/>
+          </w:tcPr>
+          <w:p>
+            <w:r>
+              <w:rPr>
+                <w:rFonts w:ascii="Courier New" w:hAnsi="Courier New"/>
+                <w:b/>
+                <w:sz w:val="18"/>
+              </w:rPr>
+              <w:t>Ctrl+Shift+P</w:t>
+            </w:r>
+          </w:p>
+        </w:tc>
+        <w:tc>
+          <w:tcPr>
+            <w:tcW w:type="dxa" w:w="5270"/>
+          </w:tcPr>
+          <w:p>
+            <w:r>
+              <w:rPr>
+                <w:sz w:val="18"/>
+              </w:rPr>
+              <w:t>Command palette</w:t>
+            </w:r>
+          </w:p>
+        </w:tc>
+      </w:tr>
+      <w:tr>
+        <w:tc>
+          <w:tcPr>
+            <w:tcW w:type="dxa" w:w="5270"/>
+          </w:tcPr>
+          <w:p>
+            <w:r>
+              <w:rPr>
+                <w:rFonts w:ascii="Courier New" w:hAnsi="Courier New"/>
+                <w:b/>
+                <w:sz w:val="18"/>
+              </w:rPr>
+              <w:t>Ctrl+Shift+Space</w:t>
+            </w:r>
+          </w:p>
+        </w:tc>
+        <w:tc>
+          <w:tcPr>
+            <w:tcW w:type="dxa" w:w="5270"/>
+          </w:tcPr>
+          <w:p>
+            <w:r>
+              <w:rPr>
+                <w:sz w:val="18"/>
+              </w:rPr>
+              <w:t>Quick select mode (select IPs, hashes, paths)</w:t>
+            </w:r>
+          </w:p>
+        </w:tc>
+      </w:tr>
+    </w:tbl>
+    <w:p>
+      <w:r>
+        <w:rPr>
+          <w:b/>
+          <w:color w:val="F38BA8"/>
+          <w:sz w:val="22"/>
+        </w:rPr>
+        <w:t>SELECTION &amp; QUICK SELECT</w:t>
+      </w:r>
+    </w:p>
+    <w:tbl>
+      <w:tblPr>
+        <w:tblW w:type="auto" w:w="0"/>
+        <w:tblLayout w:type="autofit"/>
+        <w:tblLook w:firstColumn="1" w:firstRow="1" w:lastColumn="0" w:lastRow="0" w:noHBand="0" w:noVBand="1" w:val="04A0"/>
+      </w:tblPr>
+      <w:tblGrid>
+        <w:gridCol w:w="5270"/>
+        <w:gridCol w:w="5270"/>
+      </w:tblGrid>
+      <w:tr>
+        <w:tc>
+          <w:tcPr>
+            <w:tcW w:type="dxa" w:w="5270"/>
+          </w:tcPr>
+          <w:p>
+            <w:r>
+              <w:rPr>
+                <w:rFonts w:ascii="Courier New" w:hAnsi="Courier New"/>
+                <w:b/>
+                <w:sz w:val="18"/>
+              </w:rPr>
+              <w:t>Click+Drag</w:t>
+            </w:r>
+          </w:p>
+        </w:tc>
+        <w:tc>
+          <w:tcPr>
+            <w:tcW w:type="dxa" w:w="5270"/>
+          </w:tcPr>
+          <w:p>
+            <w:r>
+              <w:rPr>
+                <w:sz w:val="18"/>
+              </w:rPr>
+              <w:t>Select text (auto-copies)</w:t>
+            </w:r>
+          </w:p>
+        </w:tc>
+      </w:tr>
+      <w:tr>
+        <w:tc>
+          <w:tcPr>
+            <w:tcW w:type="dxa" w:w="5270"/>
+          </w:tcPr>
+          <w:p>
+            <w:r>
+              <w:rPr>
+                <w:rFonts w:ascii="Courier New" w:hAnsi="Courier New"/>
+                <w:b/>
+                <w:sz w:val="18"/>
+              </w:rPr>
+              <w:t>Double-Click</w:t>
+            </w:r>
+          </w:p>
+        </w:tc>
+        <w:tc>
+          <w:tcPr>
+            <w:tcW w:type="dxa" w:w="5270"/>
+          </w:tcPr>
+          <w:p>
+            <w:r>
+              <w:rPr>
+                <w:sz w:val="18"/>
+              </w:rPr>
+              <w:t>Select word</w:t>
+            </w:r>
+          </w:p>
+        </w:tc>
+      </w:tr>
+      <w:tr>
+        <w:tc>
+          <w:tcPr>
+            <w:tcW w:type="dxa" w:w="5270"/>
+          </w:tcPr>
+          <w:p>
+            <w:r>
+              <w:rPr>
+                <w:rFonts w:ascii="Courier New" w:hAnsi="Courier New"/>
+                <w:b/>
+                <w:sz w:val="18"/>
+              </w:rPr>
+              <w:t>Triple-Click</w:t>
+            </w:r>
+          </w:p>
+        </w:tc>
+        <w:tc>
+          <w:tcPr>
+            <w:tcW w:type="dxa" w:w="5270"/>
+          </w:tcPr>
+          <w:p>
+            <w:r>
+              <w:rPr>
+                <w:sz w:val="18"/>
+              </w:rPr>
+              <w:t>Select line</w:t>
+            </w:r>
+          </w:p>
+        </w:tc>
+      </w:tr>
+      <w:tr>
+        <w:tc>
+          <w:tcPr>
+            <w:tcW w:type="dxa" w:w="5270"/>
+          </w:tcPr>
+          <w:p>
+            <w:r>
+              <w:rPr>
+                <w:rFonts w:ascii="Courier New" w:hAnsi="Courier New"/>
+                <w:b/>
+                <w:sz w:val="18"/>
+              </w:rPr>
+              <w:t>Ctrl+Shift+Space</w:t>
+            </w:r>
+          </w:p>
+        </w:tc>
+        <w:tc>
+          <w:tcPr>
+            <w:tcW w:type="dxa" w:w="5270"/>
+          </w:tcPr>
+          <w:p>
+            <w:r>
+              <w:rPr>
+                <w:sz w:val="18"/>
+              </w:rPr>
+              <w:t>Quick select — highlights IPs, URLs, paths, hashes</w:t>
+            </w:r>
+          </w:p>
+        </w:tc>
+      </w:tr>
+      <w:tr>
+        <w:tc>
+          <w:tcPr>
+            <w:tcW w:type="dxa" w:w="5270"/>
+          </w:tcPr>
+          <w:p>
+            <w:r>
+              <w:rPr>
+                <w:rFonts w:ascii="Courier New" w:hAnsi="Courier New"/>
+                <w:b/>
+                <w:sz w:val="18"/>
+              </w:rPr>
+              <w:t>Ctrl+Shift+X</w:t>
+            </w:r>
+          </w:p>
+        </w:tc>
+        <w:tc>
+          <w:tcPr>
+            <w:tcW w:type="dxa" w:w="5270"/>
+          </w:tcPr>
+          <w:p>
+            <w:r>
+              <w:rPr>
+                <w:sz w:val="18"/>
+              </w:rPr>
+              <w:t>Activate copy mode (vim-style selection)</w:t>
+            </w:r>
+          </w:p>
+        </w:tc>
+      </w:tr>
+    </w:tbl>
+    <w:p>
+      <w:r>
+        <w:rPr>
+          <w:b/>
+          <w:color w:val="A6E3A1"/>
+          <w:sz w:val="16"/>
+        </w:rPr>
+        <w:t xml:space="preserve">TIP: </w:t>
+      </w:r>
+      <w:r>
+        <w:rPr>
+          <w:sz w:val="16"/>
+        </w:rPr>
+        <w:t>Quick Select (Ctrl+Shift+Space) is great for copying IPs and paths without manual selection</w:t>
+      </w:r>
+    </w:p>
+    <w:p>
+      <w:r>
+        <w:rPr>
+          <w:b/>
+          <w:color w:val="A6E3A1"/>
+          <w:sz w:val="16"/>
+        </w:rPr>
+        <w:t xml:space="preserve">TIP: </w:t>
+      </w:r>
+      <w:r>
+        <w:rPr>
+          <w:sz w:val="16"/>
+        </w:rPr>
+        <w:t>Ctrl+Click on any URL to open it in your browser</w:t>
+      </w:r>
+    </w:p>
+    <w:p>
+      <w:r>
+        <w:rPr>
+          <w:b/>
+          <w:color w:val="A6E3A1"/>
+          <w:sz w:val="16"/>
+        </w:rPr>
+        <w:t xml:space="preserve">TIP: </w:t>
+      </w:r>
+      <w:r>
+        <w:rPr>
+          <w:sz w:val="16"/>
+        </w:rPr>
+        <w:t>Config auto-reloads — edit ~/.wezterm.lua and changes apply instantly</w:t>
+      </w:r>
+    </w:p>
+    <w:p>
+      <w:r>
+        <w:rPr>
+          <w:b/>
+          <w:color w:val="A6E3A1"/>
+          <w:sz w:val="16"/>
+        </w:rPr>
+        <w:t xml:space="preserve">TIP: </w:t>
+      </w:r>
+      <w:r>
+        <w:rPr>
+          <w:sz w:val="16"/>
+        </w:rPr>
+        <w:t>Close confirmation is enabled — you won't accidentally lose SSH sessions</w:t>
       </w:r>
     </w:p>
     <w:sectPr>

</xml_diff>